<commit_message>
Update evaluation docs and scene labels
This commit adds the individual IP1 testing result submission documents, updates the consolidated testing results form, and swaps the Intro/Interview labels in the PodcastHub scene to reflect the latest prototype wording.
</commit_message>
<xml_diff>
--- a/Evaluation1/IP1_Testing_Results_Form.docx
+++ b/Evaluation1/IP1_Testing_Results_Form.docx
@@ -7,8 +7,6 @@
         <w:pStyle w:val="31"/>
         <w:jc w:val="center"/>
       </w:pPr>
-      <w:bookmarkStart w:id="0" w:name="_GoBack"/>
-      <w:bookmarkEnd w:id="0"/>
       <w:r>
         <w:t>IP1 Testing Results Form</w:t>
       </w:r>
@@ -304,7 +302,6 @@
       <w:tblGrid>
         <w:gridCol w:w="1800"/>
         <w:gridCol w:w="1080"/>
-        <w:gridCol w:w="893"/>
         <w:gridCol w:w="691"/>
         <w:gridCol w:w="1037"/>
         <w:gridCol w:w="1037"/>
@@ -364,32 +361,6 @@
                 <w:sz w:val="15"/>
               </w:rPr>
               <w:t>Success</w:t>
-            </w:r>
-          </w:p>
-        </w:tc>
-        <w:tc>
-          <w:tcPr>
-            <w:tcW w:w="893" w:type="dxa"/>
-            <w:shd w:val="clear" w:color="auto" w:fill="D9EAF7"/>
-            <w:tcMar>
-              <w:top w:w="70" w:type="dxa"/>
-              <w:left w:w="70" w:type="dxa"/>
-              <w:bottom w:w="70" w:type="dxa"/>
-              <w:right w:w="70" w:type="dxa"/>
-            </w:tcMar>
-            <w:vAlign w:val="center"/>
-          </w:tcPr>
-          <w:p>
-            <w:pPr>
-              <w:spacing w:before="0" w:after="0" w:line="240" w:lineRule="auto"/>
-            </w:pPr>
-            <w:r>
-              <w:rPr>
-                <w:rFonts w:ascii="Arial" w:hAnsi="Arial"/>
-                <w:b/>
-                <w:sz w:val="15"/>
-              </w:rPr>
-              <w:t>Time</w:t>
             </w:r>
           </w:p>
         </w:tc>
@@ -553,30 +524,6 @@
         </w:tc>
         <w:tc>
           <w:tcPr>
-            <w:tcW w:w="893" w:type="dxa"/>
-            <w:tcMar>
-              <w:top w:w="70" w:type="dxa"/>
-              <w:left w:w="70" w:type="dxa"/>
-              <w:bottom w:w="70" w:type="dxa"/>
-              <w:right w:w="70" w:type="dxa"/>
-            </w:tcMar>
-            <w:vAlign w:val="center"/>
-          </w:tcPr>
-          <w:p>
-            <w:pPr>
-              <w:spacing w:before="0" w:after="0" w:line="240" w:lineRule="auto"/>
-            </w:pPr>
-            <w:r>
-              <w:rPr>
-                <w:rFonts w:ascii="Arial" w:hAnsi="Arial"/>
-                <w:sz w:val="15"/>
-              </w:rPr>
-              <w:t>____ sec</w:t>
-            </w:r>
-          </w:p>
-        </w:tc>
-        <w:tc>
-          <w:tcPr>
             <w:tcW w:w="691" w:type="dxa"/>
             <w:tcMar>
               <w:top w:w="70" w:type="dxa"/>
@@ -715,30 +662,6 @@
                 <w:sz w:val="15"/>
               </w:rPr>
               <w:t>☐ Yes  ☐ No</w:t>
-            </w:r>
-          </w:p>
-        </w:tc>
-        <w:tc>
-          <w:tcPr>
-            <w:tcW w:w="893" w:type="dxa"/>
-            <w:tcMar>
-              <w:top w:w="70" w:type="dxa"/>
-              <w:left w:w="70" w:type="dxa"/>
-              <w:bottom w:w="70" w:type="dxa"/>
-              <w:right w:w="70" w:type="dxa"/>
-            </w:tcMar>
-            <w:vAlign w:val="center"/>
-          </w:tcPr>
-          <w:p>
-            <w:pPr>
-              <w:spacing w:before="0" w:after="0" w:line="240" w:lineRule="auto"/>
-            </w:pPr>
-            <w:r>
-              <w:rPr>
-                <w:rFonts w:ascii="Arial" w:hAnsi="Arial"/>
-                <w:sz w:val="15"/>
-              </w:rPr>
-              <w:t>____ sec</w:t>
             </w:r>
           </w:p>
         </w:tc>
@@ -887,30 +810,6 @@
         </w:tc>
         <w:tc>
           <w:tcPr>
-            <w:tcW w:w="893" w:type="dxa"/>
-            <w:tcMar>
-              <w:top w:w="70" w:type="dxa"/>
-              <w:left w:w="70" w:type="dxa"/>
-              <w:bottom w:w="70" w:type="dxa"/>
-              <w:right w:w="70" w:type="dxa"/>
-            </w:tcMar>
-            <w:vAlign w:val="center"/>
-          </w:tcPr>
-          <w:p>
-            <w:pPr>
-              <w:spacing w:before="0" w:after="0" w:line="240" w:lineRule="auto"/>
-            </w:pPr>
-            <w:r>
-              <w:rPr>
-                <w:rFonts w:ascii="Arial" w:hAnsi="Arial"/>
-                <w:sz w:val="15"/>
-              </w:rPr>
-              <w:t>____ sec</w:t>
-            </w:r>
-          </w:p>
-        </w:tc>
-        <w:tc>
-          <w:tcPr>
             <w:tcW w:w="691" w:type="dxa"/>
             <w:tcMar>
               <w:top w:w="70" w:type="dxa"/>
@@ -1054,30 +953,6 @@
         </w:tc>
         <w:tc>
           <w:tcPr>
-            <w:tcW w:w="893" w:type="dxa"/>
-            <w:tcMar>
-              <w:top w:w="70" w:type="dxa"/>
-              <w:left w:w="70" w:type="dxa"/>
-              <w:bottom w:w="70" w:type="dxa"/>
-              <w:right w:w="70" w:type="dxa"/>
-            </w:tcMar>
-            <w:vAlign w:val="center"/>
-          </w:tcPr>
-          <w:p>
-            <w:pPr>
-              <w:spacing w:before="0" w:after="0" w:line="240" w:lineRule="auto"/>
-            </w:pPr>
-            <w:r>
-              <w:rPr>
-                <w:rFonts w:ascii="Arial" w:hAnsi="Arial"/>
-                <w:sz w:val="15"/>
-              </w:rPr>
-              <w:t>____ sec</w:t>
-            </w:r>
-          </w:p>
-        </w:tc>
-        <w:tc>
-          <w:tcPr>
             <w:tcW w:w="691" w:type="dxa"/>
             <w:tcMar>
               <w:top w:w="70" w:type="dxa"/>
@@ -1216,30 +1091,6 @@
                 <w:sz w:val="15"/>
               </w:rPr>
               <w:t>☐ Yes  ☐ No</w:t>
-            </w:r>
-          </w:p>
-        </w:tc>
-        <w:tc>
-          <w:tcPr>
-            <w:tcW w:w="893" w:type="dxa"/>
-            <w:tcMar>
-              <w:top w:w="70" w:type="dxa"/>
-              <w:left w:w="70" w:type="dxa"/>
-              <w:bottom w:w="70" w:type="dxa"/>
-              <w:right w:w="70" w:type="dxa"/>
-            </w:tcMar>
-            <w:vAlign w:val="center"/>
-          </w:tcPr>
-          <w:p>
-            <w:pPr>
-              <w:spacing w:before="0" w:after="0" w:line="240" w:lineRule="auto"/>
-            </w:pPr>
-            <w:r>
-              <w:rPr>
-                <w:rFonts w:ascii="Arial" w:hAnsi="Arial"/>
-                <w:sz w:val="15"/>
-              </w:rPr>
-              <w:t>____ sec</w:t>
             </w:r>
           </w:p>
         </w:tc>
@@ -2351,13 +2202,6 @@
               </w:rPr>
               <w:br w:type="textWrapping"/>
             </w:r>
-            <w:r>
-              <w:rPr>
-                <w:rFonts w:ascii="Arial" w:hAnsi="Arial"/>
-                <w:sz w:val="17"/>
-              </w:rPr>
-              <w:br w:type="textWrapping"/>
-            </w:r>
           </w:p>
         </w:tc>
       </w:tr>
@@ -2644,7 +2488,12 @@
         <w:t xml:space="preserve">Recording guide: </w:t>
       </w:r>
       <w:r>
-        <w:t>Mark assistance as Yes whenever a moderator hint is required. Record notable hesitation, incorrect actions, and comments that could inform the next design iteration.</w:t>
+        <w:t>Mark assistance as Yes whenever a moderator hint is required. Record notable hesitation, incorrect actions, and comments t</w:t>
+      </w:r>
+      <w:bookmarkStart w:id="0" w:name="_GoBack"/>
+      <w:bookmarkEnd w:id="0"/>
+      <w:r>
+        <w:t>hat could inform the next design iteration.</w:t>
       </w:r>
     </w:p>
     <w:sectPr>

</xml_diff>